<commit_message>
Publish workspace from pulse-cluster @ 3c99c0a
Page built with --flat so pdf/ and the Markdown sources resolve from the
site root. Assets refreshed alongside it.
</commit_message>
<xml_diff>
--- a/pdf/PULSE-PLAN-002_Sprint_2_Backlog.docx
+++ b/pdf/PULSE-PLAN-002_Sprint_2_Backlog.docx
@@ -61,7 +61,7 @@
         <w:pStyle w:val="Date"/>
       </w:pPr>
       <w:r>
-        <w:t xml:space="preserve">2026-09-11</w:t>
+        <w:t xml:space="preserve">2026-09-23</w:t>
       </w:r>
     </w:p>
     <w:sdt>
@@ -216,7 +216,7 @@
               <w:jc w:val="left"/>
             </w:pPr>
             <w:r>
-              <w:t xml:space="preserve">0.3</w:t>
+              <w:t xml:space="preserve">0.4</w:t>
             </w:r>
           </w:p>
         </w:tc>
@@ -264,7 +264,7 @@
               <w:jc w:val="left"/>
             </w:pPr>
             <w:r>
-              <w:t xml:space="preserve">2026-09-11</w:t>
+              <w:t xml:space="preserve">2026-09-23</w:t>
             </w:r>
           </w:p>
         </w:tc>
@@ -619,6 +619,52 @@
             </w:pPr>
             <w:r>
               <w:t xml:space="preserve">Week 4 checkpoint added as section 8: per-item state verified against the repository, hours position, decisions requested. Sprint 1 review recorded as held with no comments</w:t>
+            </w:r>
+          </w:p>
+        </w:tc>
+      </w:tr>
+      <w:tr>
+        <w:tc>
+          <w:p>
+            <w:pPr>
+              <w:pStyle w:val="Compact"/>
+              <w:jc w:val="left"/>
+            </w:pPr>
+            <w:r>
+              <w:t xml:space="preserve">0.4</w:t>
+            </w:r>
+          </w:p>
+        </w:tc>
+        <w:tc>
+          <w:p>
+            <w:pPr>
+              <w:pStyle w:val="Compact"/>
+              <w:jc w:val="left"/>
+            </w:pPr>
+            <w:r>
+              <w:t xml:space="preserve">2026-09-23</w:t>
+            </w:r>
+          </w:p>
+        </w:tc>
+        <w:tc>
+          <w:p>
+            <w:pPr>
+              <w:pStyle w:val="Compact"/>
+              <w:jc w:val="left"/>
+            </w:pPr>
+            <w:r>
+              <w:t xml:space="preserve">A. Abdelghany</w:t>
+            </w:r>
+          </w:p>
+        </w:tc>
+        <w:tc>
+          <w:p>
+            <w:pPr>
+              <w:pStyle w:val="Compact"/>
+              <w:jc w:val="left"/>
+            </w:pPr>
+            <w:r>
+              <w:t xml:space="preserve">Week 6 checkpoint added as section 8.5: state per item on 23 September, definition of done against the gate, decisions taken while implementing</w:t>
             </w:r>
           </w:p>
         </w:tc>
@@ -4343,6 +4389,1233 @@
       </w:r>
       <w:r>
         <w:t xml:space="preserve">September rather than on the morning of the demo.</w:t>
+      </w:r>
+    </w:p>
+    <w:p>
+      <w:pPr>
+        <w:pStyle w:val="Heading2"/>
+      </w:pPr>
+      <w:bookmarkStart w:id="34" w:name="state-at-the-close-of-week-6"/>
+      <w:r>
+        <w:t xml:space="preserve">8.5 State at the close of week 6</w:t>
+      </w:r>
+      <w:bookmarkEnd w:id="34"/>
+    </w:p>
+    <w:p>
+      <w:pPr>
+        <w:pStyle w:val="FirstParagraph"/>
+      </w:pPr>
+      <w:r>
+        <w:t xml:space="preserve">Checked against the repository on 23 September, two days before the gate.</w:t>
+      </w:r>
+      <w:r>
+        <w:t xml:space="preserve"> </w:t>
+      </w:r>
+      <w:r>
+        <w:t xml:space="preserve">Nothing landed between the week 4 checkpoint and 23 September; everything</w:t>
+      </w:r>
+      <w:r>
+        <w:t xml:space="preserve"> </w:t>
+      </w:r>
+      <w:r>
+        <w:t xml:space="preserve">below landed on 23 September.</w:t>
+      </w:r>
+    </w:p>
+    <w:tbl>
+      <w:tblPr>
+        <w:tblStyle w:val="Table"/>
+        <w:tblW w:type="pct" w:w="5000.0"/>
+        <w:tblLook w:firstRow="1"/>
+      </w:tblPr>
+      <w:tblGrid>
+        <w:gridCol w:w="304"/>
+        <w:gridCol w:w="1980"/>
+        <w:gridCol w:w="1066"/>
+        <w:gridCol w:w="1675"/>
+        <w:gridCol w:w="2893"/>
+      </w:tblGrid>
+      <w:tr>
+        <w:trPr>
+          <w:cnfStyle w:firstRow="1"/>
+        </w:trPr>
+        <w:tc>
+          <w:tcPr>
+            <w:tcBorders>
+              <w:bottom w:val="single"/>
+            </w:tcBorders>
+            <w:vAlign w:val="bottom"/>
+          </w:tcPr>
+          <w:p>
+            <w:pPr>
+              <w:pStyle w:val="Compact"/>
+              <w:jc w:val="left"/>
+            </w:pPr>
+            <w:r>
+              <w:t xml:space="preserve">#</w:t>
+            </w:r>
+          </w:p>
+        </w:tc>
+        <w:tc>
+          <w:tcPr>
+            <w:tcBorders>
+              <w:bottom w:val="single"/>
+            </w:tcBorders>
+            <w:vAlign w:val="bottom"/>
+          </w:tcPr>
+          <w:p>
+            <w:pPr>
+              <w:pStyle w:val="Compact"/>
+              <w:jc w:val="left"/>
+            </w:pPr>
+            <w:r>
+              <w:t xml:space="preserve">Item</w:t>
+            </w:r>
+          </w:p>
+        </w:tc>
+        <w:tc>
+          <w:tcPr>
+            <w:tcBorders>
+              <w:bottom w:val="single"/>
+            </w:tcBorders>
+            <w:vAlign w:val="bottom"/>
+          </w:tcPr>
+          <w:p>
+            <w:pPr>
+              <w:pStyle w:val="Compact"/>
+              <w:jc w:val="left"/>
+            </w:pPr>
+            <w:r>
+              <w:t xml:space="preserve">Target</w:t>
+            </w:r>
+          </w:p>
+        </w:tc>
+        <w:tc>
+          <w:tcPr>
+            <w:tcBorders>
+              <w:bottom w:val="single"/>
+            </w:tcBorders>
+            <w:vAlign w:val="bottom"/>
+          </w:tcPr>
+          <w:p>
+            <w:pPr>
+              <w:pStyle w:val="Compact"/>
+              <w:jc w:val="left"/>
+            </w:pPr>
+            <w:r>
+              <w:t xml:space="preserve">State on 23 September</w:t>
+            </w:r>
+          </w:p>
+        </w:tc>
+        <w:tc>
+          <w:tcPr>
+            <w:tcBorders>
+              <w:bottom w:val="single"/>
+            </w:tcBorders>
+            <w:vAlign w:val="bottom"/>
+          </w:tcPr>
+          <w:p>
+            <w:pPr>
+              <w:pStyle w:val="Compact"/>
+              <w:jc w:val="left"/>
+            </w:pPr>
+            <w:r>
+              <w:t xml:space="preserve">Checked by</w:t>
+            </w:r>
+          </w:p>
+        </w:tc>
+      </w:tr>
+      <w:tr>
+        <w:tc>
+          <w:p>
+            <w:pPr>
+              <w:pStyle w:val="Compact"/>
+              <w:jc w:val="left"/>
+            </w:pPr>
+            <w:r>
+              <w:t xml:space="preserve">1</w:t>
+            </w:r>
+          </w:p>
+        </w:tc>
+        <w:tc>
+          <w:p>
+            <w:pPr>
+              <w:pStyle w:val="Compact"/>
+              <w:jc w:val="left"/>
+            </w:pPr>
+            <w:r>
+              <w:t xml:space="preserve">Regression suite</w:t>
+            </w:r>
+          </w:p>
+        </w:tc>
+        <w:tc>
+          <w:p>
+            <w:pPr>
+              <w:pStyle w:val="Compact"/>
+              <w:jc w:val="left"/>
+            </w:pPr>
+            <w:r>
+              <w:t xml:space="preserve">Implemented</w:t>
+            </w:r>
+          </w:p>
+        </w:tc>
+        <w:tc>
+          <w:p>
+            <w:pPr>
+              <w:pStyle w:val="Compact"/>
+              <w:jc w:val="left"/>
+            </w:pPr>
+            <w:r>
+              <w:t xml:space="preserve">Implemented</w:t>
+            </w:r>
+          </w:p>
+        </w:tc>
+        <w:tc>
+          <w:p>
+            <w:pPr>
+              <w:pStyle w:val="Compact"/>
+              <w:jc w:val="left"/>
+            </w:pPr>
+            <w:r>
+              <w:t xml:space="preserve">16 checks,</w:t>
+            </w:r>
+            <w:r>
+              <w:t xml:space="preserve"> </w:t>
+            </w:r>
+            <w:r>
+              <w:rPr>
+                <w:rStyle w:val="VerbatimChar"/>
+              </w:rPr>
+              <w:t xml:space="preserve">.github/workflows/regression.yml</w:t>
+            </w:r>
+            <w:r>
+              <w:t xml:space="preserve"> </w:t>
+            </w:r>
+            <w:r>
+              <w:t xml:space="preserve">runs them on every push. Evidence under</w:t>
+            </w:r>
+            <w:r>
+              <w:t xml:space="preserve"> </w:t>
+            </w:r>
+            <w:r>
+              <w:rPr>
+                <w:rStyle w:val="VerbatimChar"/>
+              </w:rPr>
+              <w:t xml:space="preserve">docs/evidence/</w:t>
+            </w:r>
+          </w:p>
+        </w:tc>
+      </w:tr>
+      <w:tr>
+        <w:tc>
+          <w:p>
+            <w:pPr>
+              <w:pStyle w:val="Compact"/>
+              <w:jc w:val="left"/>
+            </w:pPr>
+            <w:r>
+              <w:t xml:space="preserve">2</w:t>
+            </w:r>
+          </w:p>
+        </w:tc>
+        <w:tc>
+          <w:p>
+            <w:pPr>
+              <w:pStyle w:val="Compact"/>
+              <w:jc w:val="left"/>
+            </w:pPr>
+            <w:r>
+              <w:t xml:space="preserve">Signal contract test</w:t>
+            </w:r>
+          </w:p>
+        </w:tc>
+        <w:tc>
+          <w:p>
+            <w:pPr>
+              <w:pStyle w:val="Compact"/>
+              <w:jc w:val="left"/>
+            </w:pPr>
+            <w:r>
+              <w:t xml:space="preserve">Implemented</w:t>
+            </w:r>
+          </w:p>
+        </w:tc>
+        <w:tc>
+          <w:p>
+            <w:pPr>
+              <w:pStyle w:val="Compact"/>
+              <w:jc w:val="left"/>
+            </w:pPr>
+            <w:r>
+              <w:t xml:space="preserve">Implemented</w:t>
+            </w:r>
+          </w:p>
+        </w:tc>
+        <w:tc>
+          <w:p>
+            <w:pPr>
+              <w:pStyle w:val="Compact"/>
+              <w:jc w:val="left"/>
+            </w:pPr>
+            <w:r>
+              <w:rPr>
+                <w:rStyle w:val="VerbatimChar"/>
+              </w:rPr>
+              <w:t xml:space="preserve">live-contract</w:t>
+            </w:r>
+            <w:r>
+              <w:t xml:space="preserve">: all 28 appendix A paths subscribe and deliver a typed datapoint from the running broker</w:t>
+            </w:r>
+          </w:p>
+        </w:tc>
+      </w:tr>
+      <w:tr>
+        <w:tc>
+          <w:p>
+            <w:pPr>
+              <w:pStyle w:val="Compact"/>
+              <w:jc w:val="left"/>
+            </w:pPr>
+            <w:r>
+              <w:t xml:space="preserve">3</w:t>
+            </w:r>
+          </w:p>
+        </w:tc>
+        <w:tc>
+          <w:p>
+            <w:pPr>
+              <w:pStyle w:val="Compact"/>
+              <w:jc w:val="left"/>
+            </w:pPr>
+            <w:r>
+              <w:t xml:space="preserve">UI smoke test per build</w:t>
+            </w:r>
+          </w:p>
+        </w:tc>
+        <w:tc>
+          <w:p>
+            <w:pPr>
+              <w:pStyle w:val="Compact"/>
+              <w:jc w:val="left"/>
+            </w:pPr>
+            <w:r>
+              <w:t xml:space="preserve">Implemented</w:t>
+            </w:r>
+          </w:p>
+        </w:tc>
+        <w:tc>
+          <w:p>
+            <w:pPr>
+              <w:pStyle w:val="Compact"/>
+              <w:jc w:val="left"/>
+            </w:pPr>
+            <w:r>
+              <w:t xml:space="preserve">Partial</w:t>
+            </w:r>
+          </w:p>
+        </w:tc>
+        <w:tc>
+          <w:p>
+            <w:pPr>
+              <w:pStyle w:val="Compact"/>
+              <w:jc w:val="left"/>
+            </w:pPr>
+            <w:r>
+              <w:t xml:space="preserve">Flutter:</w:t>
+            </w:r>
+            <w:r>
+              <w:t xml:space="preserve"> </w:t>
+            </w:r>
+            <w:r>
+              <w:rPr>
+                <w:rStyle w:val="VerbatimChar"/>
+              </w:rPr>
+              <w:t xml:space="preserve">test/cluster_smoke_test.dart</w:t>
+            </w:r>
+            <w:r>
+              <w:t xml:space="preserve"> </w:t>
+            </w:r>
+            <w:r>
+              <w:t xml:space="preserve">renders an injected 87 km/h in gear 4 and asserts it. Compose: unit-tested, no emulator without KVM on this host</w:t>
+            </w:r>
+          </w:p>
+        </w:tc>
+      </w:tr>
+      <w:tr>
+        <w:tc>
+          <w:p>
+            <w:pPr>
+              <w:pStyle w:val="Compact"/>
+              <w:jc w:val="left"/>
+            </w:pPr>
+            <w:r>
+              <w:t xml:space="preserve">4</w:t>
+            </w:r>
+          </w:p>
+        </w:tc>
+        <w:tc>
+          <w:p>
+            <w:pPr>
+              <w:pStyle w:val="Compact"/>
+              <w:jc w:val="left"/>
+            </w:pPr>
+            <w:r>
+              <w:t xml:space="preserve">Flutter staleness display</w:t>
+            </w:r>
+          </w:p>
+        </w:tc>
+        <w:tc>
+          <w:p>
+            <w:pPr>
+              <w:pStyle w:val="Compact"/>
+              <w:jc w:val="left"/>
+            </w:pPr>
+            <w:r>
+              <w:t xml:space="preserve">Implemented</w:t>
+            </w:r>
+          </w:p>
+        </w:tc>
+        <w:tc>
+          <w:p>
+            <w:pPr>
+              <w:pStyle w:val="Compact"/>
+              <w:jc w:val="left"/>
+            </w:pPr>
+            <w:r>
+              <w:t xml:space="preserve">Implemented</w:t>
+            </w:r>
+          </w:p>
+        </w:tc>
+        <w:tc>
+          <w:p>
+            <w:pPr>
+              <w:pStyle w:val="Compact"/>
+              <w:jc w:val="left"/>
+            </w:pPr>
+            <w:r>
+              <w:t xml:space="preserve">Degrades within 1 s of broker loss; screen captures and widget tests</w:t>
+            </w:r>
+          </w:p>
+        </w:tc>
+      </w:tr>
+      <w:tr>
+        <w:tc>
+          <w:p>
+            <w:pPr>
+              <w:pStyle w:val="Compact"/>
+              <w:jc w:val="left"/>
+            </w:pPr>
+            <w:r>
+              <w:t xml:space="preserve">5</w:t>
+            </w:r>
+          </w:p>
+        </w:tc>
+        <w:tc>
+          <w:p>
+            <w:pPr>
+              <w:pStyle w:val="Compact"/>
+              <w:jc w:val="left"/>
+            </w:pPr>
+            <w:r>
+              <w:t xml:space="preserve">Compose staleness display</w:t>
+            </w:r>
+          </w:p>
+        </w:tc>
+        <w:tc>
+          <w:p>
+            <w:pPr>
+              <w:pStyle w:val="Compact"/>
+              <w:jc w:val="left"/>
+            </w:pPr>
+            <w:r>
+              <w:t xml:space="preserve">Implemented</w:t>
+            </w:r>
+          </w:p>
+        </w:tc>
+        <w:tc>
+          <w:p>
+            <w:pPr>
+              <w:pStyle w:val="Compact"/>
+              <w:jc w:val="left"/>
+            </w:pPr>
+            <w:r>
+              <w:t xml:space="preserve">Partial</w:t>
+            </w:r>
+          </w:p>
+        </w:tc>
+        <w:tc>
+          <w:p>
+            <w:pPr>
+              <w:pStyle w:val="Compact"/>
+              <w:jc w:val="left"/>
+            </w:pPr>
+            <w:r>
+              <w:t xml:space="preserve">Same model in</w:t>
+            </w:r>
+            <w:r>
+              <w:t xml:space="preserve"> </w:t>
+            </w:r>
+            <w:r>
+              <w:rPr>
+                <w:rStyle w:val="VerbatimChar"/>
+              </w:rPr>
+              <w:t xml:space="preserve">VssClient.kt</w:t>
+            </w:r>
+            <w:r>
+              <w:t xml:space="preserve">, compiled and unit-tested; not yet seen on a device</w:t>
+            </w:r>
+          </w:p>
+        </w:tc>
+      </w:tr>
+      <w:tr>
+        <w:tc>
+          <w:p>
+            <w:pPr>
+              <w:pStyle w:val="Compact"/>
+              <w:jc w:val="left"/>
+            </w:pPr>
+            <w:r>
+              <w:t xml:space="preserve">6</w:t>
+            </w:r>
+          </w:p>
+        </w:tc>
+        <w:tc>
+          <w:p>
+            <w:pPr>
+              <w:pStyle w:val="Compact"/>
+              <w:jc w:val="left"/>
+            </w:pPr>
+            <w:r>
+              <w:t xml:space="preserve">Mutual TLS on the broker</w:t>
+            </w:r>
+          </w:p>
+        </w:tc>
+        <w:tc>
+          <w:p>
+            <w:pPr>
+              <w:pStyle w:val="Compact"/>
+              <w:jc w:val="left"/>
+            </w:pPr>
+            <w:r>
+              <w:t xml:space="preserve">Implemented</w:t>
+            </w:r>
+          </w:p>
+        </w:tc>
+        <w:tc>
+          <w:p>
+            <w:pPr>
+              <w:pStyle w:val="Compact"/>
+              <w:jc w:val="left"/>
+            </w:pPr>
+            <w:r>
+              <w:t xml:space="preserve">Implemented with deviation</w:t>
+            </w:r>
+          </w:p>
+        </w:tc>
+        <w:tc>
+          <w:p>
+            <w:pPr>
+              <w:pStyle w:val="Compact"/>
+              <w:jc w:val="left"/>
+            </w:pPr>
+            <w:r>
+              <w:t xml:space="preserve">TLS and per-client tokens, secure by default;</w:t>
+            </w:r>
+            <w:r>
+              <w:t xml:space="preserve"> </w:t>
+            </w:r>
+            <w:r>
+              <w:rPr>
+                <w:rStyle w:val="VerbatimChar"/>
+              </w:rPr>
+              <w:t xml:space="preserve">transport-security</w:t>
+            </w:r>
+            <w:r>
+              <w:t xml:space="preserve"> </w:t>
+            </w:r>
+            <w:r>
+              <w:t xml:space="preserve">proves the refusals. KUKSA 0.7.0 cannot verify client certificates (SEC section 5, DD-12)</w:t>
+            </w:r>
+          </w:p>
+        </w:tc>
+      </w:tr>
+      <w:tr>
+        <w:tc>
+          <w:p>
+            <w:pPr>
+              <w:pStyle w:val="Compact"/>
+              <w:jc w:val="left"/>
+            </w:pPr>
+            <w:r>
+              <w:t xml:space="preserve">7</w:t>
+            </w:r>
+          </w:p>
+        </w:tc>
+        <w:tc>
+          <w:p>
+            <w:pPr>
+              <w:pStyle w:val="Compact"/>
+              <w:jc w:val="left"/>
+            </w:pPr>
+            <w:r>
+              <w:t xml:space="preserve">Pin the Flutter SDK</w:t>
+            </w:r>
+          </w:p>
+        </w:tc>
+        <w:tc>
+          <w:p>
+            <w:pPr>
+              <w:pStyle w:val="Compact"/>
+              <w:jc w:val="left"/>
+            </w:pPr>
+            <w:r>
+              <w:t xml:space="preserve">Partial</w:t>
+            </w:r>
+          </w:p>
+        </w:tc>
+        <w:tc>
+          <w:p>
+            <w:pPr>
+              <w:pStyle w:val="Compact"/>
+              <w:jc w:val="left"/>
+            </w:pPr>
+            <w:r>
+              <w:t xml:space="preserve">Implemented</w:t>
+            </w:r>
+          </w:p>
+        </w:tc>
+        <w:tc>
+          <w:p>
+            <w:pPr>
+              <w:pStyle w:val="Compact"/>
+              <w:jc w:val="left"/>
+            </w:pPr>
+            <w:r>
+              <w:t xml:space="preserve">3.47.0 in</w:t>
+            </w:r>
+            <w:r>
+              <w:t xml:space="preserve"> </w:t>
+            </w:r>
+            <w:r>
+              <w:rPr>
+                <w:rStyle w:val="VerbatimChar"/>
+              </w:rPr>
+              <w:t xml:space="preserve">.fvmrc</w:t>
+            </w:r>
+            <w:r>
+              <w:t xml:space="preserve">, floor in</w:t>
+            </w:r>
+            <w:r>
+              <w:t xml:space="preserve"> </w:t>
+            </w:r>
+            <w:r>
+              <w:rPr>
+                <w:rStyle w:val="VerbatimChar"/>
+              </w:rPr>
+              <w:t xml:space="preserve">pubspec.yaml</w:t>
+            </w:r>
+            <w:r>
+              <w:t xml:space="preserve">,</w:t>
+            </w:r>
+            <w:r>
+              <w:t xml:space="preserve"> </w:t>
+            </w:r>
+            <w:r>
+              <w:rPr>
+                <w:rStyle w:val="VerbatimChar"/>
+              </w:rPr>
+              <w:t xml:space="preserve">toolchain-pin</w:t>
+            </w:r>
+            <w:r>
+              <w:t xml:space="preserve"> </w:t>
+            </w:r>
+            <w:r>
+              <w:t xml:space="preserve">check</w:t>
+            </w:r>
+          </w:p>
+        </w:tc>
+      </w:tr>
+      <w:tr>
+        <w:tc>
+          <w:p>
+            <w:pPr>
+              <w:pStyle w:val="Compact"/>
+              <w:jc w:val="left"/>
+            </w:pPr>
+            <w:r>
+              <w:t xml:space="preserve">8</w:t>
+            </w:r>
+          </w:p>
+        </w:tc>
+        <w:tc>
+          <w:p>
+            <w:pPr>
+              <w:pStyle w:val="Compact"/>
+              <w:jc w:val="left"/>
+            </w:pPr>
+            <w:r>
+              <w:t xml:space="preserve">SBOM and vulnerability check</w:t>
+            </w:r>
+          </w:p>
+        </w:tc>
+        <w:tc>
+          <w:p>
+            <w:pPr>
+              <w:pStyle w:val="Compact"/>
+              <w:jc w:val="left"/>
+            </w:pPr>
+            <w:r>
+              <w:t xml:space="preserve">Implemented</w:t>
+            </w:r>
+          </w:p>
+        </w:tc>
+        <w:tc>
+          <w:p>
+            <w:pPr>
+              <w:pStyle w:val="Compact"/>
+              <w:jc w:val="left"/>
+            </w:pPr>
+            <w:r>
+              <w:t xml:space="preserve">Implemented</w:t>
+            </w:r>
+          </w:p>
+        </w:tc>
+        <w:tc>
+          <w:p>
+            <w:pPr>
+              <w:pStyle w:val="Compact"/>
+              <w:jc w:val="left"/>
+            </w:pPr>
+            <w:r>
+              <w:t xml:space="preserve">85 components, OSV clean after Pillow was fixed by moving to Python 3.11</w:t>
+            </w:r>
+          </w:p>
+        </w:tc>
+      </w:tr>
+      <w:tr>
+        <w:tc>
+          <w:p>
+            <w:pPr>
+              <w:pStyle w:val="Compact"/>
+              <w:jc w:val="left"/>
+            </w:pPr>
+            <w:r>
+              <w:t xml:space="preserve">9</w:t>
+            </w:r>
+          </w:p>
+        </w:tc>
+        <w:tc>
+          <w:p>
+            <w:pPr>
+              <w:pStyle w:val="Compact"/>
+              <w:jc w:val="left"/>
+            </w:pPr>
+            <w:r>
+              <w:t xml:space="preserve">Driver-monitor privacy test</w:t>
+            </w:r>
+          </w:p>
+        </w:tc>
+        <w:tc>
+          <w:p>
+            <w:pPr>
+              <w:pStyle w:val="Compact"/>
+              <w:jc w:val="left"/>
+            </w:pPr>
+            <w:r>
+              <w:t xml:space="preserve">Implemented</w:t>
+            </w:r>
+          </w:p>
+        </w:tc>
+        <w:tc>
+          <w:p>
+            <w:pPr>
+              <w:pStyle w:val="Compact"/>
+              <w:jc w:val="left"/>
+            </w:pPr>
+            <w:r>
+              <w:t xml:space="preserve">Partial</w:t>
+            </w:r>
+          </w:p>
+        </w:tc>
+        <w:tc>
+          <w:p>
+            <w:pPr>
+              <w:pStyle w:val="Compact"/>
+              <w:jc w:val="left"/>
+            </w:pPr>
+            <w:r>
+              <w:rPr>
+                <w:rStyle w:val="VerbatimChar"/>
+              </w:rPr>
+              <w:t xml:space="preserve">dms-privacy</w:t>
+            </w:r>
+            <w:r>
+              <w:t xml:space="preserve"> </w:t>
+            </w:r>
+            <w:r>
+              <w:t xml:space="preserve">written; needs AVX to run the monitor, so skips here and runs in CI</w:t>
+            </w:r>
+          </w:p>
+        </w:tc>
+      </w:tr>
+      <w:tr>
+        <w:tc>
+          <w:p>
+            <w:pPr>
+              <w:pStyle w:val="Compact"/>
+              <w:jc w:val="left"/>
+            </w:pPr>
+            <w:r>
+              <w:t xml:space="preserve">10</w:t>
+            </w:r>
+          </w:p>
+        </w:tc>
+        <w:tc>
+          <w:p>
+            <w:pPr>
+              <w:pStyle w:val="Compact"/>
+              <w:jc w:val="left"/>
+            </w:pPr>
+            <w:r>
+              <w:t xml:space="preserve">HMI-side range check</w:t>
+            </w:r>
+          </w:p>
+        </w:tc>
+        <w:tc>
+          <w:p>
+            <w:pPr>
+              <w:pStyle w:val="Compact"/>
+              <w:jc w:val="left"/>
+            </w:pPr>
+            <w:r>
+              <w:t xml:space="preserve">Implemented</w:t>
+            </w:r>
+          </w:p>
+        </w:tc>
+        <w:tc>
+          <w:p>
+            <w:pPr>
+              <w:pStyle w:val="Compact"/>
+              <w:jc w:val="left"/>
+            </w:pPr>
+            <w:r>
+              <w:t xml:space="preserve">Implemented</w:t>
+            </w:r>
+          </w:p>
+        </w:tc>
+        <w:tc>
+          <w:p>
+            <w:pPr>
+              <w:pStyle w:val="Compact"/>
+              <w:jc w:val="left"/>
+            </w:pPr>
+            <w:r>
+              <w:t xml:space="preserve">Both HMIs read catalogue limits from the broker and refuse values outside them;</w:t>
+            </w:r>
+            <w:r>
+              <w:t xml:space="preserve"> </w:t>
+            </w:r>
+            <w:r>
+              <w:rPr>
+                <w:rStyle w:val="VerbatimChar"/>
+              </w:rPr>
+              <w:t xml:space="preserve">range-refusal</w:t>
+            </w:r>
+            <w:r>
+              <w:t xml:space="preserve"> </w:t>
+            </w:r>
+            <w:r>
+              <w:t xml:space="preserve">proves the broker refuses first</w:t>
+            </w:r>
+          </w:p>
+        </w:tc>
+      </w:tr>
+      <w:tr>
+        <w:tc>
+          <w:p>
+            <w:pPr>
+              <w:pStyle w:val="Compact"/>
+              <w:jc w:val="left"/>
+            </w:pPr>
+            <w:r>
+              <w:t xml:space="preserve">11</w:t>
+            </w:r>
+          </w:p>
+        </w:tc>
+        <w:tc>
+          <w:p>
+            <w:pPr>
+              <w:pStyle w:val="Compact"/>
+              <w:jc w:val="left"/>
+            </w:pPr>
+            <w:r>
+              <w:t xml:space="preserve">Catalogue checksum</w:t>
+            </w:r>
+          </w:p>
+        </w:tc>
+        <w:tc>
+          <w:p>
+            <w:pPr>
+              <w:pStyle w:val="Compact"/>
+              <w:jc w:val="left"/>
+            </w:pPr>
+            <w:r>
+              <w:t xml:space="preserve">Implemented</w:t>
+            </w:r>
+          </w:p>
+        </w:tc>
+        <w:tc>
+          <w:p>
+            <w:pPr>
+              <w:pStyle w:val="Compact"/>
+              <w:jc w:val="left"/>
+            </w:pPr>
+            <w:r>
+              <w:t xml:space="preserve">Implemented</w:t>
+            </w:r>
+          </w:p>
+        </w:tc>
+        <w:tc>
+          <w:p>
+            <w:pPr>
+              <w:pStyle w:val="Compact"/>
+              <w:jc w:val="left"/>
+            </w:pPr>
+            <w:r>
+              <w:rPr>
+                <w:rStyle w:val="VerbatimChar"/>
+              </w:rPr>
+              <w:t xml:space="preserve">catalogue-checksum</w:t>
+            </w:r>
+            <w:r>
+              <w:t xml:space="preserve">; a one-character edit fails the run</w:t>
+            </w:r>
+          </w:p>
+        </w:tc>
+      </w:tr>
+      <w:tr>
+        <w:tc>
+          <w:p>
+            <w:pPr>
+              <w:pStyle w:val="Compact"/>
+              <w:jc w:val="left"/>
+            </w:pPr>
+            <w:r>
+              <w:t xml:space="preserve">12</w:t>
+            </w:r>
+          </w:p>
+        </w:tc>
+        <w:tc>
+          <w:p>
+            <w:pPr>
+              <w:pStyle w:val="Compact"/>
+              <w:jc w:val="left"/>
+            </w:pPr>
+            <w:r>
+              <w:t xml:space="preserve">Merge the monitoring branch</w:t>
+            </w:r>
+          </w:p>
+        </w:tc>
+        <w:tc>
+          <w:p>
+            <w:pPr>
+              <w:pStyle w:val="Compact"/>
+              <w:jc w:val="left"/>
+            </w:pPr>
+            <w:r>
+              <w:t xml:space="preserve">Done</w:t>
+            </w:r>
+          </w:p>
+        </w:tc>
+        <w:tc>
+          <w:p>
+            <w:pPr>
+              <w:pStyle w:val="Compact"/>
+              <w:jc w:val="left"/>
+            </w:pPr>
+            <w:r>
+              <w:t xml:space="preserve">Done</w:t>
+            </w:r>
+          </w:p>
+        </w:tc>
+        <w:tc>
+          <w:p>
+            <w:pPr>
+              <w:pStyle w:val="Compact"/>
+              <w:jc w:val="left"/>
+            </w:pPr>
+            <w:r>
+              <w:t xml:space="preserve">4 September</w:t>
+            </w:r>
+          </w:p>
+        </w:tc>
+      </w:tr>
+      <w:tr>
+        <w:tc>
+          <w:p>
+            <w:pPr>
+              <w:pStyle w:val="Compact"/>
+              <w:jc w:val="left"/>
+            </w:pPr>
+            <w:r>
+              <w:t xml:space="preserve">13</w:t>
+            </w:r>
+          </w:p>
+        </w:tc>
+        <w:tc>
+          <w:p>
+            <w:pPr>
+              <w:pStyle w:val="Compact"/>
+              <w:jc w:val="left"/>
+            </w:pPr>
+            <w:r>
+              <w:t xml:space="preserve">Architecture write-ups</w:t>
+            </w:r>
+          </w:p>
+        </w:tc>
+        <w:tc>
+          <w:p>
+            <w:pPr>
+              <w:pStyle w:val="Compact"/>
+              <w:jc w:val="left"/>
+            </w:pPr>
+            <w:r>
+              <w:t xml:space="preserve">Implemented</w:t>
+            </w:r>
+          </w:p>
+        </w:tc>
+        <w:tc>
+          <w:p>
+            <w:pPr>
+              <w:pStyle w:val="Compact"/>
+              <w:jc w:val="left"/>
+            </w:pPr>
+            <w:r>
+              <w:t xml:space="preserve">Implemented</w:t>
+            </w:r>
+          </w:p>
+        </w:tc>
+        <w:tc>
+          <w:p>
+            <w:pPr>
+              <w:pStyle w:val="Compact"/>
+              <w:jc w:val="left"/>
+            </w:pPr>
+            <w:r>
+              <w:t xml:space="preserve">PULSE-SWAD-001, one page each for the Flutter cluster and the providers</w:t>
+            </w:r>
+          </w:p>
+        </w:tc>
+      </w:tr>
+      <w:tr>
+        <w:tc>
+          <w:p>
+            <w:pPr>
+              <w:pStyle w:val="Compact"/>
+              <w:jc w:val="left"/>
+            </w:pPr>
+            <w:r>
+              <w:t xml:space="preserve">14</w:t>
+            </w:r>
+          </w:p>
+        </w:tc>
+        <w:tc>
+          <w:p>
+            <w:pPr>
+              <w:pStyle w:val="Compact"/>
+              <w:jc w:val="left"/>
+            </w:pPr>
+            <w:r>
+              <w:t xml:space="preserve">Safety and security review</w:t>
+            </w:r>
+          </w:p>
+        </w:tc>
+        <w:tc>
+          <w:p>
+            <w:pPr>
+              <w:pStyle w:val="Compact"/>
+              <w:jc w:val="left"/>
+            </w:pPr>
+            <w:r>
+              <w:t xml:space="preserve">Reviewed</w:t>
+            </w:r>
+          </w:p>
+        </w:tc>
+        <w:tc>
+          <w:p>
+            <w:pPr>
+              <w:pStyle w:val="Compact"/>
+              <w:jc w:val="left"/>
+            </w:pPr>
+            <w:r>
+              <w:t xml:space="preserve">Not held</w:t>
+            </w:r>
+          </w:p>
+        </w:tc>
+        <w:tc>
+          <w:p>
+            <w:pPr>
+              <w:pStyle w:val="Compact"/>
+              <w:jc w:val="left"/>
+            </w:pPr>
+            <w:r>
+              <w:t xml:space="preserve">Needs the two managers; nothing an engineer can do alone</w:t>
+            </w:r>
+          </w:p>
+        </w:tc>
+      </w:tr>
+      <w:tr>
+        <w:tc>
+          <w:p>
+            <w:pPr>
+              <w:pStyle w:val="Compact"/>
+              <w:jc w:val="left"/>
+            </w:pPr>
+            <w:r>
+              <w:t xml:space="preserve">15</w:t>
+            </w:r>
+          </w:p>
+        </w:tc>
+        <w:tc>
+          <w:p>
+            <w:pPr>
+              <w:pStyle w:val="Compact"/>
+              <w:jc w:val="left"/>
+            </w:pPr>
+            <w:r>
+              <w:t xml:space="preserve">Virtual CAN feeder spike</w:t>
+            </w:r>
+          </w:p>
+        </w:tc>
+        <w:tc>
+          <w:p>
+            <w:pPr>
+              <w:pStyle w:val="Compact"/>
+              <w:jc w:val="left"/>
+            </w:pPr>
+            <w:r>
+              <w:t xml:space="preserve">Partial</w:t>
+            </w:r>
+          </w:p>
+        </w:tc>
+        <w:tc>
+          <w:p>
+            <w:pPr>
+              <w:pStyle w:val="Compact"/>
+              <w:jc w:val="left"/>
+            </w:pPr>
+            <w:r>
+              <w:t xml:space="preserve">Implemented</w:t>
+            </w:r>
+          </w:p>
+        </w:tc>
+        <w:tc>
+          <w:p>
+            <w:pPr>
+              <w:pStyle w:val="Compact"/>
+              <w:jc w:val="left"/>
+            </w:pPr>
+            <w:r>
+              <w:rPr>
+                <w:rStyle w:val="VerbatimChar"/>
+              </w:rPr>
+              <w:t xml:space="preserve">scripts/can_spike.py</w:t>
+            </w:r>
+            <w:r>
+              <w:t xml:space="preserve">: three signals from</w:t>
+            </w:r>
+            <w:r>
+              <w:t xml:space="preserve"> </w:t>
+            </w:r>
+            <w:r>
+              <w:rPr>
+                <w:rStyle w:val="VerbatimChar"/>
+              </w:rPr>
+              <w:t xml:space="preserve">vcan0</w:t>
+            </w:r>
+            <w:r>
+              <w:t xml:space="preserve"> </w:t>
+            </w:r>
+            <w:r>
+              <w:t xml:space="preserve">through AGL’s DBC and KUKSA’s provider, over TLS, into the catalogue</w:t>
+            </w:r>
+          </w:p>
+        </w:tc>
+      </w:tr>
+    </w:tbl>
+    <w:p>
+      <w:pPr>
+        <w:pStyle w:val="BodyText"/>
+      </w:pPr>
+      <w:r>
+        <w:t xml:space="preserve">Definition of done for the gate (section 7): 1 met; 2 met on Flutter, not</w:t>
+      </w:r>
+      <w:r>
+        <w:t xml:space="preserve"> </w:t>
+      </w:r>
+      <w:r>
+        <w:t xml:space="preserve">yet shown on Compose; 3 met with the deviation above; 4 met; 5 the bring-up</w:t>
+      </w:r>
+      <w:r>
+        <w:t xml:space="preserve"> </w:t>
+      </w:r>
+      <w:r>
+        <w:t xml:space="preserve">was timed at 3.9 s on a virtual 2560 x 720 screen, the physical strip is</w:t>
+      </w:r>
+      <w:r>
+        <w:t xml:space="preserve"> </w:t>
+      </w:r>
+      <w:r>
+        <w:t xml:space="preserve">not on this host.</w:t>
+      </w:r>
+    </w:p>
+    <w:p>
+      <w:pPr>
+        <w:pStyle w:val="BodyText"/>
+      </w:pPr>
+      <w:r>
+        <w:t xml:space="preserve">Decisions taken while implementing, for the review to confirm or reverse:</w:t>
+      </w:r>
+      <w:r>
+        <w:t xml:space="preserve"> </w:t>
+      </w:r>
+      <w:r>
+        <w:t xml:space="preserve">Python 3.11 for the providers (the reason is in</w:t>
+      </w:r>
+      <w:r>
+        <w:t xml:space="preserve"> </w:t>
+      </w:r>
+      <w:r>
+        <w:rPr>
+          <w:rStyle w:val="VerbatimChar"/>
+        </w:rPr>
+        <w:t xml:space="preserve">requirements.txt</w:t>
+      </w:r>
+      <w:r>
+        <w:t xml:space="preserve">);</w:t>
+      </w:r>
+      <w:r>
+        <w:t xml:space="preserve"> </w:t>
+      </w:r>
+      <w:r>
+        <w:t xml:space="preserve">Flutter stays at 3.47.0; freshness is judged by arrival time rather than the</w:t>
+      </w:r>
+      <w:r>
+        <w:t xml:space="preserve"> </w:t>
+      </w:r>
+      <w:r>
+        <w:t xml:space="preserve">broker’s timestamp (SAF section 3); token authentication stands in for mutual</w:t>
+      </w:r>
+      <w:r>
+        <w:t xml:space="preserve"> </w:t>
+      </w:r>
+      <w:r>
+        <w:t xml:space="preserve">TLS (SEC section 5). One finding: the driver monitor cannot run on this VM</w:t>
+      </w:r>
+      <w:r>
+        <w:t xml:space="preserve"> </w:t>
+      </w:r>
+      <w:r>
+        <w:t xml:space="preserve">because it exposes no AVX, so the sprint 3 target and the demo host must.</w:t>
       </w:r>
     </w:p>
     <w:sectPr/>

</xml_diff>

<commit_message>
Publish workspace from pulse-cluster @ c8337f7
Page built with --flat so pdf/ and the Markdown sources resolve from the
site root. Assets refreshed alongside it.
</commit_message>
<xml_diff>
--- a/pdf/PULSE-PLAN-002_Sprint_2_Backlog.docx
+++ b/pdf/PULSE-PLAN-002_Sprint_2_Backlog.docx
@@ -6301,13 +6301,49 @@
         <w:t xml:space="preserve"> </w:t>
       </w:r>
       <w:r>
-        <w:t xml:space="preserve">CS-3 deviation; 4 met; 5 open until the rehearsal on the strip, which this</w:t>
-      </w:r>
-      <w:r>
-        <w:t xml:space="preserve"> </w:t>
-      </w:r>
-      <w:r>
-        <w:t xml:space="preserve">host has.</w:t>
+        <w:t xml:space="preserve">CS-3 deviation; 4 met; 5 met on the physical strip:</w:t>
+      </w:r>
+      <w:r>
+        <w:t xml:space="preserve"> </w:t>
+      </w:r>
+      <w:r>
+        <w:rPr>
+          <w:rStyle w:val="VerbatimChar"/>
+        </w:rPr>
+        <w:t xml:space="preserve">./run.sh</w:t>
+      </w:r>
+      <w:r>
+        <w:t xml:space="preserve"> </w:t>
+      </w:r>
+      <w:r>
+        <w:t xml:space="preserve">to the</w:t>
+      </w:r>
+      <w:r>
+        <w:t xml:space="preserve"> </w:t>
+      </w:r>
+      <w:r>
+        <w:t xml:space="preserve">cluster on the strip in 4.1 to 5.1 s with the broker start included, and the</w:t>
+      </w:r>
+      <w:r>
+        <w:t xml:space="preserve"> </w:t>
+      </w:r>
+      <w:r>
+        <w:t xml:space="preserve">broker-loss demo recorded as live, degraded and recovered</w:t>
+      </w:r>
+      <w:r>
+        <w:t xml:space="preserve"> </w:t>
+      </w:r>
+      <w:r>
+        <w:t xml:space="preserve">(</w:t>
+      </w:r>
+      <w:r>
+        <w:rPr>
+          <w:rStyle w:val="VerbatimChar"/>
+        </w:rPr>
+        <w:t xml:space="preserve">docs/evidence/screens/20261002-flutter-strip-*</w:t>
+      </w:r>
+      <w:r>
+        <w:t xml:space="preserve">).</w:t>
       </w:r>
     </w:p>
     <w:p>
@@ -6581,6 +6617,217 @@
       </w:r>
       <w:r>
         <w:t xml:space="preserve">It now reconnects.</w:t>
+      </w:r>
+    </w:p>
+    <w:p>
+      <w:pPr>
+        <w:numPr>
+          <w:ilvl w:val="0"/>
+          <w:numId w:val="1003"/>
+        </w:numPr>
+        <w:pStyle w:val="Compact"/>
+      </w:pPr>
+      <w:r>
+        <w:rPr>
+          <w:bCs/>
+          <w:b/>
+        </w:rPr>
+        <w:t xml:space="preserve">The Flutter cluster did not recover from a broker restart.</w:t>
+      </w:r>
+      <w:r>
+        <w:t xml:space="preserve"> </w:t>
+      </w:r>
+      <w:r>
+        <w:t xml:space="preserve">It</w:t>
+      </w:r>
+      <w:r>
+        <w:t xml:space="preserve"> </w:t>
+      </w:r>
+      <w:r>
+        <w:t xml:space="preserve">degraded correctly, but the Dart gRPC stream stayed open after the</w:t>
+      </w:r>
+      <w:r>
+        <w:t xml:space="preserve"> </w:t>
+      </w:r>
+      <w:r>
+        <w:t xml:space="preserve">broker died and the client never resubscribed. Three seconds of silence</w:t>
+      </w:r>
+      <w:r>
+        <w:t xml:space="preserve"> </w:t>
+      </w:r>
+      <w:r>
+        <w:t xml:space="preserve">now ends the stream; recovery measured at 2.6 to 3.9 s. Found only on</w:t>
+      </w:r>
+      <w:r>
+        <w:t xml:space="preserve"> </w:t>
+      </w:r>
+      <w:r>
+        <w:t xml:space="preserve">the strip rehearsal, which is the argument for rehearsing on it.</w:t>
+      </w:r>
+    </w:p>
+    <w:p>
+      <w:pPr>
+        <w:numPr>
+          <w:ilvl w:val="0"/>
+          <w:numId w:val="1003"/>
+        </w:numPr>
+        <w:pStyle w:val="Compact"/>
+      </w:pPr>
+      <w:r>
+        <w:rPr>
+          <w:bCs/>
+          <w:b/>
+        </w:rPr>
+        <w:t xml:space="preserve">An empty entry counted as an arrival.</w:t>
+      </w:r>
+      <w:r>
+        <w:t xml:space="preserve"> </w:t>
+      </w:r>
+      <w:r>
+        <w:t xml:space="preserve">A new subscription opens with</w:t>
+      </w:r>
+      <w:r>
+        <w:t xml:space="preserve"> </w:t>
+      </w:r>
+      <w:r>
+        <w:t xml:space="preserve">an empty entry for every path without a value; both clusters took it as</w:t>
+      </w:r>
+      <w:r>
+        <w:t xml:space="preserve"> </w:t>
+      </w:r>
+      <w:r>
+        <w:t xml:space="preserve">fresh, so an absent driver monitor raised no warning for one second</w:t>
+      </w:r>
+      <w:r>
+        <w:t xml:space="preserve"> </w:t>
+      </w:r>
+      <w:r>
+        <w:t xml:space="preserve">after reconnecting. Both now ignore empty entries; Flutter test added.</w:t>
+      </w:r>
+    </w:p>
+    <w:p>
+      <w:pPr>
+        <w:numPr>
+          <w:ilvl w:val="0"/>
+          <w:numId w:val="1003"/>
+        </w:numPr>
+        <w:pStyle w:val="Compact"/>
+      </w:pPr>
+      <w:r>
+        <w:rPr>
+          <w:bCs/>
+          <w:b/>
+        </w:rPr>
+        <w:t xml:space="preserve">The suite left driver monitors running.</w:t>
+      </w:r>
+      <w:r>
+        <w:t xml:space="preserve"> </w:t>
+      </w:r>
+      <w:r>
+        <w:t xml:space="preserve">Ending</w:t>
+      </w:r>
+      <w:r>
+        <w:t xml:space="preserve"> </w:t>
+      </w:r>
+      <w:r>
+        <w:rPr>
+          <w:rStyle w:val="VerbatimChar"/>
+        </w:rPr>
+        <w:t xml:space="preserve">strace</w:t>
+      </w:r>
+      <w:r>
+        <w:t xml:space="preserve"> </w:t>
+      </w:r>
+      <w:r>
+        <w:t xml:space="preserve">in</w:t>
+      </w:r>
+      <w:r>
+        <w:t xml:space="preserve"> </w:t>
+      </w:r>
+      <w:r>
+        <w:rPr>
+          <w:rStyle w:val="VerbatimChar"/>
+        </w:rPr>
+        <w:t xml:space="preserve">dms-privacy</w:t>
+      </w:r>
+      <w:r>
+        <w:t xml:space="preserve"> </w:t>
+      </w:r>
+      <w:r>
+        <w:t xml:space="preserve">did not end the traced monitor, and each orphan kept</w:t>
+      </w:r>
+      <w:r>
+        <w:t xml:space="preserve"> </w:t>
+      </w:r>
+      <w:r>
+        <w:t xml:space="preserve">publishing driver state. The suite now ends whole process groups.</w:t>
+      </w:r>
+    </w:p>
+    <w:p>
+      <w:pPr>
+        <w:numPr>
+          <w:ilvl w:val="0"/>
+          <w:numId w:val="1003"/>
+        </w:numPr>
+        <w:pStyle w:val="Compact"/>
+      </w:pPr>
+      <w:r>
+        <w:rPr>
+          <w:bCs/>
+          <w:b/>
+        </w:rPr>
+        <w:t xml:space="preserve">The CAN provider forwarded the hazard only on change.</w:t>
+      </w:r>
+      <w:r>
+        <w:t xml:space="preserve"> </w:t>
+      </w:r>
+      <w:r>
+        <w:t xml:space="preserve">The catalogue</w:t>
+      </w:r>
+      <w:r>
+        <w:t xml:space="preserve"> </w:t>
+      </w:r>
+      <w:r>
+        <w:t xml:space="preserve">maps it with</w:t>
+      </w:r>
+      <w:r>
+        <w:t xml:space="preserve"> </w:t>
+      </w:r>
+      <w:r>
+        <w:rPr>
+          <w:rStyle w:val="VerbatimChar"/>
+        </w:rPr>
+        <w:t xml:space="preserve">on_change</w:t>
+      </w:r>
+      <w:r>
+        <w:t xml:space="preserve">, so in CAN mode an unchanged hazard would go</w:t>
+      </w:r>
+      <w:r>
+        <w:t xml:space="preserve"> </w:t>
+      </w:r>
+      <w:r>
+        <w:t xml:space="preserve">stale after 2 s. The provider’s own mapping copy forwards every safety</w:t>
+      </w:r>
+      <w:r>
+        <w:t xml:space="preserve"> </w:t>
+      </w:r>
+      <w:r>
+        <w:t xml:space="preserve">signal at 100 ms;</w:t>
+      </w:r>
+      <w:r>
+        <w:t xml:space="preserve"> </w:t>
+      </w:r>
+      <w:r>
+        <w:rPr>
+          <w:rStyle w:val="VerbatimChar"/>
+        </w:rPr>
+        <w:t xml:space="preserve">can-path</w:t>
+      </w:r>
+      <w:r>
+        <w:t xml:space="preserve"> </w:t>
+      </w:r>
+      <w:r>
+        <w:t xml:space="preserve">asserts the hazard stays fresh.</w:t>
       </w:r>
     </w:p>
     <w:p>

</xml_diff>

<commit_message>
Publish workspace from pulse-cluster @ edfa994
Page built with --flat so pdf/ and the Markdown sources resolve from the
site root. Assets refreshed alongside it.
</commit_message>
<xml_diff>
--- a/pdf/PULSE-PLAN-002_Sprint_2_Backlog.docx
+++ b/pdf/PULSE-PLAN-002_Sprint_2_Backlog.docx
@@ -6239,7 +6239,7 @@
               <w:jc w:val="left"/>
             </w:pPr>
             <w:r>
-              <w:t xml:space="preserve">The simulator can act as the vehicle’s ECUs on</w:t>
+              <w:t xml:space="preserve">The simulator acts as the vehicle’s ECUs on</w:t>
             </w:r>
             <w:r>
               <w:t xml:space="preserve"> </w:t>
@@ -6263,7 +6263,7 @@
               <w:t xml:space="preserve">CAN=1 ./run.sh</w:t>
             </w:r>
             <w:r>
-              <w:t xml:space="preserve">);</w:t>
+              <w:t xml:space="preserve">, shown on the strip);</w:t>
             </w:r>
             <w:r>
               <w:t xml:space="preserve"> </w:t>
@@ -6278,12 +6278,44 @@
               <w:t xml:space="preserve"> </w:t>
             </w:r>
             <w:r>
-              <w:t xml:space="preserve">covers all 35 mapped signals in CI</w:t>
+              <w:t xml:space="preserve">covers all 35 mapped signals in CI;</w:t>
+            </w:r>
+            <w:r>
+              <w:t xml:space="preserve"> </w:t>
+            </w:r>
+            <w:r>
+              <w:rPr>
+                <w:rStyle w:val="VerbatimChar"/>
+              </w:rPr>
+              <w:t xml:space="preserve">can-path</w:t>
+            </w:r>
+            <w:r>
+              <w:t xml:space="preserve"> </w:t>
+            </w:r>
+            <w:r>
+              <w:t xml:space="preserve">passes live; a recorded lap replays from</w:t>
+            </w:r>
+            <w:r>
+              <w:t xml:space="preserve"> </w:t>
+            </w:r>
+            <w:r>
+              <w:rPr>
+                <w:rStyle w:val="VerbatimChar"/>
+              </w:rPr>
+              <w:t xml:space="preserve">emulator/can_logs/</w:t>
             </w:r>
           </w:p>
         </w:tc>
       </w:tr>
     </w:tbl>
+    <w:p>
+      <w:pPr>
+        <w:pStyle w:val="BodyText"/>
+      </w:pPr>
+      <w:r>
+        <w:t xml:space="preserve">The full suite passed 19 of 19 on 2 October with every check executing, none skipped (report 2026-10-02 08:38).</w:t>
+      </w:r>
+    </w:p>
     <w:p>
       <w:pPr>
         <w:pStyle w:val="BodyText"/>
@@ -6828,6 +6860,110 @@
       </w:r>
       <w:r>
         <w:t xml:space="preserve">asserts the hazard stays fresh.</w:t>
+      </w:r>
+    </w:p>
+    <w:p>
+      <w:pPr>
+        <w:numPr>
+          <w:ilvl w:val="0"/>
+          <w:numId w:val="1003"/>
+        </w:numPr>
+        <w:pStyle w:val="Compact"/>
+      </w:pPr>
+      <w:r>
+        <w:rPr>
+          <w:bCs/>
+          <w:b/>
+        </w:rPr>
+        <w:t xml:space="preserve">The device check would have used any attached phone.</w:t>
+      </w:r>
+      <w:r>
+        <w:t xml:space="preserve"> </w:t>
+      </w:r>
+      <w:r>
+        <w:t xml:space="preserve">With a phone</w:t>
+      </w:r>
+      <w:r>
+        <w:t xml:space="preserve"> </w:t>
+      </w:r>
+      <w:r>
+        <w:t xml:space="preserve">plugged in for charging,</w:t>
+      </w:r>
+      <w:r>
+        <w:t xml:space="preserve"> </w:t>
+      </w:r>
+      <w:r>
+        <w:rPr>
+          <w:rStyle w:val="VerbatimChar"/>
+        </w:rPr>
+        <w:t xml:space="preserve">compose-ui</w:t>
+      </w:r>
+      <w:r>
+        <w:t xml:space="preserve"> </w:t>
+      </w:r>
+      <w:r>
+        <w:t xml:space="preserve">aimed Gradle at it; the install</w:t>
+      </w:r>
+      <w:r>
+        <w:t xml:space="preserve"> </w:t>
+      </w:r>
+      <w:r>
+        <w:t xml:space="preserve">was refused, no test ran, and the check still passed. It now uses only</w:t>
+      </w:r>
+      <w:r>
+        <w:t xml:space="preserve"> </w:t>
+      </w:r>
+      <w:r>
+        <w:t xml:space="preserve">an emulator unless a device is named, and zero tests is a failure.</w:t>
+      </w:r>
+    </w:p>
+    <w:p>
+      <w:pPr>
+        <w:numPr>
+          <w:ilvl w:val="0"/>
+          <w:numId w:val="1003"/>
+        </w:numPr>
+        <w:pStyle w:val="Compact"/>
+      </w:pPr>
+      <w:r>
+        <w:rPr>
+          <w:rStyle w:val="VerbatimChar"/>
+          <w:bCs/>
+          <w:b/>
+        </w:rPr>
+        <w:t xml:space="preserve">can-path</w:t>
+      </w:r>
+      <w:r>
+        <w:rPr>
+          <w:bCs/>
+          <w:b/>
+        </w:rPr>
+        <w:t xml:space="preserve"> </w:t>
+      </w:r>
+      <w:r>
+        <w:rPr>
+          <w:bCs/>
+          <w:b/>
+        </w:rPr>
+        <w:t xml:space="preserve">depended on earlier checks.</w:t>
+      </w:r>
+      <w:r>
+        <w:t xml:space="preserve"> </w:t>
+      </w:r>
+      <w:r>
+        <w:t xml:space="preserve">In cruise mode the simulator</w:t>
+      </w:r>
+      <w:r>
+        <w:t xml:space="preserve"> </w:t>
+      </w:r>
+      <w:r>
+        <w:t xml:space="preserve">reacts to a driver alert left in the broker by the monitor checks with</w:t>
+      </w:r>
+      <w:r>
+        <w:t xml:space="preserve"> </w:t>
+      </w:r>
+      <w:r>
+        <w:t xml:space="preserve">its emergency stop. The check now runs the simulator in lap mode.</w:t>
       </w:r>
     </w:p>
     <w:p>
@@ -6951,7 +7087,7 @@
               <w:jc w:val="left"/>
             </w:pPr>
             <w:r>
-              <w:t xml:space="preserve">Virtual path complete; CAN HAT not started. The provider, DBC and checks do not change for</w:t>
+              <w:t xml:space="preserve">Virtual path complete and verified live, with record and replay; CAN HAT not started. The provider, DBC and checks do not change for</w:t>
             </w:r>
             <w:r>
               <w:t xml:space="preserve"> </w:t>

</xml_diff>